<commit_message>
feat(phase1/openbao): auto-unseal watcher Deployment
openbao-unsealer Deployment (security ns)를 배포해 OpenBao pod 재기동 시
수동 개입 없이 18초 이내 자동 unseal 확인.

- services/openbao-unsealer/: Alpine 24MB 이미지 (bash+curl+jq)
  - jq false // default 파싱 버그 수정: | tostring 사용
- infra/manifests/openbao/auto-unseal.yaml: SA+ConfigMap+NetworkPolicy+Deployment
  - imagePullPolicy: Never (kind local), seccomp RuntimeDefault, drop ALL caps
  - openbao-tls:ca.crt 마운트으로 TLS 검증 (--insecure 미사용)
- tests/smoke/openbao_auto_unseal_smoke.sh: pod 삭제 → Ready 검증
- docs/ops/openbao-unseal.md: auto-unseal 운영 방식 + 수동 폴백 업데이트
- Documents/openbao-unseal.docx: docs-sync

carry-over: multi-node Raft unseal 지원 (Phase 1 3-node 복원 시 필요)

Co-Authored-By: Claude Sonnet 4.6 <noreply@anthropic.com>
</commit_message>
<xml_diff>
--- a/Documents/openbao-unseal.docx
+++ b/Documents/openbao-unseal.docx
@@ -28,7 +28,7 @@
         </w:p>
       </w:sdtContent>
     </w:sdt>
-    <w:bookmarkStart w:id="17" w:name="openbao-unseal-runbook-dev"/>
+    <w:bookmarkStart w:id="22" w:name="openbao-unseal-runbook-dev"/>
     <w:p>
       <w:pPr>
         <w:pStyle w:val="Heading1"/>
@@ -64,26 +64,412 @@
         <w:t xml:space="preserve"> </w:t>
       </w:r>
       <w:r>
-        <w:t xml:space="preserve">/ OpenBao 2.0.0 / Shamir 5-of-3 seal. Phase 1에 SoftHSM 또는 K8s transit auto-unseal로 교체 예정. 지금은 pod 재기동마다</w:t>
-      </w:r>
-      <w:r>
-        <w:t xml:space="preserve"> </w:t>
-      </w:r>
+        <w:t xml:space="preserve">/ OpenBao 2.0.0 / Shamir 5-of-3 seal.</w:t>
+      </w:r>
+    </w:p>
+    <w:p>
+      <w:pPr>
+        <w:pStyle w:val="BlockText"/>
+      </w:pPr>
       <w:r>
         <w:rPr>
           <w:b/>
           <w:bCs/>
         </w:rPr>
-        <w:t xml:space="preserve">수동 unseal</w:t>
-      </w:r>
-      <w:r>
-        <w:t xml:space="preserve"> </w:t>
-      </w:r>
-      <w:r>
-        <w:t xml:space="preserve">필요.</w:t>
-      </w:r>
-    </w:p>
-    <w:bookmarkStart w:id="9" w:name="증상"/>
+        <w:t xml:space="preserve">Phase 1 완료 (2026-04-23)</w:t>
+      </w:r>
+      <w:r>
+        <w:t xml:space="preserve">:</w:t>
+      </w:r>
+      <w:r>
+        <w:t xml:space="preserve"> </w:t>
+      </w:r>
+      <w:r>
+        <w:rPr>
+          <w:rStyle w:val="VerbatimChar"/>
+        </w:rPr>
+        <w:t xml:space="preserve">openbao-unsealer</w:t>
+      </w:r>
+      <w:r>
+        <w:t xml:space="preserve"> </w:t>
+      </w:r>
+      <w:r>
+        <w:t xml:space="preserve">Deployment가</w:t>
+      </w:r>
+      <w:r>
+        <w:t xml:space="preserve"> </w:t>
+      </w:r>
+      <w:r>
+        <w:rPr>
+          <w:rStyle w:val="VerbatimChar"/>
+        </w:rPr>
+        <w:t xml:space="preserve">security</w:t>
+      </w:r>
+      <w:r>
+        <w:t xml:space="preserve"> </w:t>
+      </w:r>
+      <w:r>
+        <w:t xml:space="preserve">네임스페이스에서 실행 중.</w:t>
+      </w:r>
+      <w:r>
+        <w:t xml:space="preserve"> </w:t>
+      </w:r>
+      <w:r>
+        <w:t xml:space="preserve">pod 재기동 후</w:t>
+      </w:r>
+      <w:r>
+        <w:t xml:space="preserve"> </w:t>
+      </w:r>
+      <w:r>
+        <w:rPr>
+          <w:b/>
+          <w:bCs/>
+        </w:rPr>
+        <w:t xml:space="preserve">18초 이내 자동 unseal</w:t>
+      </w:r>
+      <w:r>
+        <w:t xml:space="preserve"> </w:t>
+      </w:r>
+      <w:r>
+        <w:t xml:space="preserve">확인. 수동 개입 불필요.</w:t>
+      </w:r>
+      <w:r>
+        <w:t xml:space="preserve"> </w:t>
+      </w:r>
+      <w:r>
+        <w:t xml:space="preserve">아래 수동 절차는 **unsealer pod 자체가 다운된 경우의 폴백(fallback)**으로 유지.</w:t>
+      </w:r>
+    </w:p>
+    <w:p>
+      <w:r>
+        <w:pict>
+          <v:rect style="width:0;height:1.5pt" o:hralign="center" o:hrstd="t" o:hr="t"/>
+        </w:pict>
+      </w:r>
+    </w:p>
+    <w:bookmarkStart w:id="12" w:name="자동-unseal-현재-운영-방식"/>
+    <w:p>
+      <w:pPr>
+        <w:pStyle w:val="Heading2"/>
+      </w:pPr>
+      <w:r>
+        <w:t xml:space="preserve">자동 unseal (현재 운영 방식)</w:t>
+      </w:r>
+    </w:p>
+    <w:p>
+      <w:pPr>
+        <w:pStyle w:val="FirstParagraph"/>
+      </w:pPr>
+      <w:r>
+        <w:rPr>
+          <w:rStyle w:val="VerbatimChar"/>
+        </w:rPr>
+        <w:t xml:space="preserve">openbao-unsealer</w:t>
+      </w:r>
+      <w:r>
+        <w:t xml:space="preserve"> </w:t>
+      </w:r>
+      <w:r>
+        <w:t xml:space="preserve">Deployment가 10초 간격으로</w:t>
+      </w:r>
+      <w:r>
+        <w:t xml:space="preserve"> </w:t>
+      </w:r>
+      <w:r>
+        <w:rPr>
+          <w:rStyle w:val="VerbatimChar"/>
+        </w:rPr>
+        <w:t xml:space="preserve">/v1/sys/seal-status</w:t>
+      </w:r>
+      <w:r>
+        <w:t xml:space="preserve">를 폴링하고,</w:t>
+      </w:r>
+      <w:r>
+        <w:t xml:space="preserve"> </w:t>
+      </w:r>
+      <w:r>
+        <w:t xml:space="preserve">sealed=true 감지 시</w:t>
+      </w:r>
+      <w:r>
+        <w:t xml:space="preserve"> </w:t>
+      </w:r>
+      <w:r>
+        <w:rPr>
+          <w:rStyle w:val="VerbatimChar"/>
+        </w:rPr>
+        <w:t xml:space="preserve">openbao-init-keys</w:t>
+      </w:r>
+      <w:r>
+        <w:t xml:space="preserve"> </w:t>
+      </w:r>
+      <w:r>
+        <w:t xml:space="preserve">Secret의 Shamir 키 3개를 자동으로 제출한다.</w:t>
+      </w:r>
+    </w:p>
+    <w:bookmarkStart w:id="9" w:name="상태-확인"/>
+    <w:p>
+      <w:pPr>
+        <w:pStyle w:val="Heading3"/>
+      </w:pPr>
+      <w:r>
+        <w:t xml:space="preserve">상태 확인</w:t>
+      </w:r>
+    </w:p>
+    <w:p>
+      <w:pPr>
+        <w:pStyle w:val="SourceCode"/>
+      </w:pPr>
+      <w:r>
+        <w:rPr>
+          <w:rStyle w:val="CommentTok"/>
+        </w:rPr>
+        <w:t xml:space="preserve"># unsealer 정상 실행 여부</w:t>
+      </w:r>
+      <w:r>
+        <w:br/>
+      </w:r>
+      <w:r>
+        <w:rPr>
+          <w:rStyle w:val="ExtensionTok"/>
+        </w:rPr>
+        <w:t xml:space="preserve">kubectl</w:t>
+      </w:r>
+      <w:r>
+        <w:rPr>
+          <w:rStyle w:val="NormalTok"/>
+        </w:rPr>
+        <w:t xml:space="preserve"> </w:t>
+      </w:r>
+      <w:r>
+        <w:rPr>
+          <w:rStyle w:val="AttributeTok"/>
+        </w:rPr>
+        <w:t xml:space="preserve">-n</w:t>
+      </w:r>
+      <w:r>
+        <w:rPr>
+          <w:rStyle w:val="NormalTok"/>
+        </w:rPr>
+        <w:t xml:space="preserve"> security get deploy openbao-unsealer</w:t>
+      </w:r>
+      <w:r>
+        <w:br/>
+      </w:r>
+      <w:r>
+        <w:br/>
+      </w:r>
+      <w:r>
+        <w:rPr>
+          <w:rStyle w:val="CommentTok"/>
+        </w:rPr>
+        <w:t xml:space="preserve"># unsealer 최근 로그 (unseal 이력 포함)</w:t>
+      </w:r>
+      <w:r>
+        <w:br/>
+      </w:r>
+      <w:r>
+        <w:rPr>
+          <w:rStyle w:val="ExtensionTok"/>
+        </w:rPr>
+        <w:t xml:space="preserve">kubectl</w:t>
+      </w:r>
+      <w:r>
+        <w:rPr>
+          <w:rStyle w:val="NormalTok"/>
+        </w:rPr>
+        <w:t xml:space="preserve"> </w:t>
+      </w:r>
+      <w:r>
+        <w:rPr>
+          <w:rStyle w:val="AttributeTok"/>
+        </w:rPr>
+        <w:t xml:space="preserve">-n</w:t>
+      </w:r>
+      <w:r>
+        <w:rPr>
+          <w:rStyle w:val="NormalTok"/>
+        </w:rPr>
+        <w:t xml:space="preserve"> security logs deploy/openbao-unsealer </w:t>
+      </w:r>
+      <w:r>
+        <w:rPr>
+          <w:rStyle w:val="AttributeTok"/>
+        </w:rPr>
+        <w:t xml:space="preserve">--tail</w:t>
+      </w:r>
+      <w:r>
+        <w:rPr>
+          <w:rStyle w:val="OperatorTok"/>
+        </w:rPr>
+        <w:t xml:space="preserve">=</w:t>
+      </w:r>
+      <w:r>
+        <w:rPr>
+          <w:rStyle w:val="NormalTok"/>
+        </w:rPr>
+        <w:t xml:space="preserve">30</w:t>
+      </w:r>
+      <w:r>
+        <w:br/>
+      </w:r>
+      <w:r>
+        <w:br/>
+      </w:r>
+      <w:r>
+        <w:rPr>
+          <w:rStyle w:val="CommentTok"/>
+        </w:rPr>
+        <w:t xml:space="preserve"># openbao-0 상태</w:t>
+      </w:r>
+      <w:r>
+        <w:br/>
+      </w:r>
+      <w:r>
+        <w:rPr>
+          <w:rStyle w:val="ExtensionTok"/>
+        </w:rPr>
+        <w:t xml:space="preserve">kubectl</w:t>
+      </w:r>
+      <w:r>
+        <w:rPr>
+          <w:rStyle w:val="NormalTok"/>
+        </w:rPr>
+        <w:t xml:space="preserve"> </w:t>
+      </w:r>
+      <w:r>
+        <w:rPr>
+          <w:rStyle w:val="AttributeTok"/>
+        </w:rPr>
+        <w:t xml:space="preserve">-n</w:t>
+      </w:r>
+      <w:r>
+        <w:rPr>
+          <w:rStyle w:val="NormalTok"/>
+        </w:rPr>
+        <w:t xml:space="preserve"> security get pod openbao-0</w:t>
+      </w:r>
+    </w:p>
+    <w:bookmarkEnd w:id="9"/>
+    <w:bookmarkStart w:id="10" w:name="unsealer-재시작-이상-감지-시"/>
+    <w:p>
+      <w:pPr>
+        <w:pStyle w:val="Heading3"/>
+      </w:pPr>
+      <w:r>
+        <w:t xml:space="preserve">unsealer 재시작 (이상 감지 시)</w:t>
+      </w:r>
+    </w:p>
+    <w:p>
+      <w:pPr>
+        <w:pStyle w:val="SourceCode"/>
+      </w:pPr>
+      <w:r>
+        <w:rPr>
+          <w:rStyle w:val="ExtensionTok"/>
+        </w:rPr>
+        <w:t xml:space="preserve">kubectl</w:t>
+      </w:r>
+      <w:r>
+        <w:rPr>
+          <w:rStyle w:val="NormalTok"/>
+        </w:rPr>
+        <w:t xml:space="preserve"> </w:t>
+      </w:r>
+      <w:r>
+        <w:rPr>
+          <w:rStyle w:val="AttributeTok"/>
+        </w:rPr>
+        <w:t xml:space="preserve">-n</w:t>
+      </w:r>
+      <w:r>
+        <w:rPr>
+          <w:rStyle w:val="NormalTok"/>
+        </w:rPr>
+        <w:t xml:space="preserve"> security rollout restart deploy/openbao-unsealer</w:t>
+      </w:r>
+      <w:r>
+        <w:br/>
+      </w:r>
+      <w:r>
+        <w:rPr>
+          <w:rStyle w:val="ExtensionTok"/>
+        </w:rPr>
+        <w:t xml:space="preserve">kubectl</w:t>
+      </w:r>
+      <w:r>
+        <w:rPr>
+          <w:rStyle w:val="NormalTok"/>
+        </w:rPr>
+        <w:t xml:space="preserve"> </w:t>
+      </w:r>
+      <w:r>
+        <w:rPr>
+          <w:rStyle w:val="AttributeTok"/>
+        </w:rPr>
+        <w:t xml:space="preserve">-n</w:t>
+      </w:r>
+      <w:r>
+        <w:rPr>
+          <w:rStyle w:val="NormalTok"/>
+        </w:rPr>
+        <w:t xml:space="preserve"> security rollout status deploy/openbao-unsealer</w:t>
+      </w:r>
+    </w:p>
+    <w:bookmarkEnd w:id="10"/>
+    <w:bookmarkStart w:id="11" w:name="smoke-test-실행"/>
+    <w:p>
+      <w:pPr>
+        <w:pStyle w:val="Heading3"/>
+      </w:pPr>
+      <w:r>
+        <w:t xml:space="preserve">smoke test 실행</w:t>
+      </w:r>
+    </w:p>
+    <w:p>
+      <w:pPr>
+        <w:pStyle w:val="SourceCode"/>
+      </w:pPr>
+      <w:r>
+        <w:rPr>
+          <w:rStyle w:val="FunctionTok"/>
+        </w:rPr>
+        <w:t xml:space="preserve">bash</w:t>
+      </w:r>
+      <w:r>
+        <w:rPr>
+          <w:rStyle w:val="NormalTok"/>
+        </w:rPr>
+        <w:t xml:space="preserve"> tests/smoke/openbao_auto_unseal_smoke.sh</w:t>
+      </w:r>
+      <w:r>
+        <w:br/>
+      </w:r>
+      <w:r>
+        <w:rPr>
+          <w:rStyle w:val="CommentTok"/>
+        </w:rPr>
+        <w:t xml:space="preserve"># - openbao-0 삭제 → 재기동 → unsealer가 자동 unseal → Ready 확인</w:t>
+      </w:r>
+      <w:r>
+        <w:br/>
+      </w:r>
+      <w:r>
+        <w:rPr>
+          <w:rStyle w:val="CommentTok"/>
+        </w:rPr>
+        <w:t xml:space="preserve"># - 성공 기준: 120s 이내 Ready</w:t>
+      </w:r>
+    </w:p>
+    <w:p>
+      <w:r>
+        <w:pict>
+          <v:rect style="width:0;height:1.5pt" o:hralign="center" o:hrstd="t" o:hr="t"/>
+        </w:pict>
+      </w:r>
+    </w:p>
+    <w:bookmarkEnd w:id="11"/>
+    <w:bookmarkEnd w:id="12"/>
+    <w:bookmarkStart w:id="13" w:name="증상"/>
     <w:p>
       <w:pPr>
         <w:pStyle w:val="Heading2"/>
@@ -104,7 +490,7 @@
         <w:rPr>
           <w:rStyle w:val="VerbatimChar"/>
         </w:rPr>
-        <w:t xml:space="preserve">kubectl -n security get pods -l app.kubernetes.io/name=openbao</w:t>
+        <w:t xml:space="preserve">kubectl -n security get pod openbao-0</w:t>
       </w:r>
       <w:r>
         <w:t xml:space="preserve"> </w:t>
@@ -125,16 +511,7 @@
         <w:t xml:space="preserve"> </w:t>
       </w:r>
       <w:r>
-        <w:t xml:space="preserve">또는</w:t>
-      </w:r>
-      <w:r>
-        <w:t xml:space="preserve"> </w:t>
-      </w:r>
-      <w:r>
-        <w:rPr>
-          <w:rStyle w:val="VerbatimChar"/>
-        </w:rPr>
-        <w:t xml:space="preserve">CrashLoopBackOff</w:t>
+        <w:t xml:space="preserve">상태가 60s 이상 지속</w:t>
       </w:r>
     </w:p>
     <w:p>
@@ -146,16 +523,22 @@
         </w:numPr>
       </w:pPr>
       <w:r>
+        <w:t xml:space="preserve">unsealer 로그에</w:t>
+      </w:r>
+      <w:r>
+        <w:t xml:space="preserve"> </w:t>
+      </w:r>
+      <w:r>
         <w:rPr>
           <w:rStyle w:val="VerbatimChar"/>
         </w:rPr>
-        <w:t xml:space="preserve">kubectl -n security logs openbao-0</w:t>
-      </w:r>
-      <w:r>
-        <w:t xml:space="preserve"> </w:t>
-      </w:r>
-      <w:r>
-        <w:t xml:space="preserve">에</w:t>
+        <w:t xml:space="preserve">unseal SUCCESS</w:t>
+      </w:r>
+      <w:r>
+        <w:t xml:space="preserve"> </w:t>
+      </w:r>
+      <w:r>
+        <w:t xml:space="preserve">대신</w:t>
       </w:r>
       <w:r>
         <w:t xml:space="preserve"> </w:t>
@@ -164,22 +547,13 @@
         <w:rPr>
           <w:rStyle w:val="VerbatimChar"/>
         </w:rPr>
-        <w:t xml:space="preserve">Vault is sealed</w:t>
-      </w:r>
-      <w:r>
-        <w:t xml:space="preserve"> </w:t>
-      </w:r>
-      <w:r>
-        <w:t xml:space="preserve">또는 health</w:t>
-      </w:r>
-      <w:r>
-        <w:t xml:space="preserve"> </w:t>
-      </w:r>
-      <w:r>
-        <w:rPr>
-          <w:rStyle w:val="VerbatimChar"/>
-        </w:rPr>
-        <w:t xml:space="preserve">HTTP 400</w:t>
+        <w:t xml:space="preserve">WARN: unreachable</w:t>
+      </w:r>
+      <w:r>
+        <w:t xml:space="preserve"> </w:t>
+      </w:r>
+      <w:r>
+        <w:t xml:space="preserve">반복</w:t>
       </w:r>
     </w:p>
     <w:p>
@@ -209,14 +583,29 @@
         <w:t xml:space="preserve">에러 반환</w:t>
       </w:r>
     </w:p>
-    <w:bookmarkEnd w:id="9"/>
-    <w:bookmarkStart w:id="10" w:name="즉시-복구-3단계-약-30초"/>
+    <w:p>
+      <w:r>
+        <w:pict>
+          <v:rect style="width:0;height:1.5pt" o:hralign="center" o:hrstd="t" o:hr="t"/>
+        </w:pict>
+      </w:r>
+    </w:p>
+    <w:bookmarkEnd w:id="13"/>
+    <w:bookmarkStart w:id="14" w:name="폴백-수동-unseal-unsealer-pod-다운-시"/>
     <w:p>
       <w:pPr>
         <w:pStyle w:val="Heading2"/>
       </w:pPr>
       <w:r>
-        <w:t xml:space="preserve">즉시 복구 (3단계, 약 30초)</w:t>
+        <w:t xml:space="preserve">폴백: 수동 unseal (unsealer pod 다운 시)</w:t>
+      </w:r>
+    </w:p>
+    <w:p>
+      <w:pPr>
+        <w:pStyle w:val="FirstParagraph"/>
+      </w:pPr>
+      <w:r>
+        <w:t xml:space="preserve">unsealer Deployment 자체가 실패한 경우에만 사용.</w:t>
       </w:r>
     </w:p>
     <w:p>
@@ -709,7 +1098,7 @@
         <w:pStyle w:val="FirstParagraph"/>
       </w:pPr>
       <w:r>
-        <w:t xml:space="preserve">그 다음 readiness probe가 15~30초 내 Ready 전환 → pod</w:t>
+        <w:t xml:space="preserve">readiness probe가 15~30초 내 통과 → pod</w:t>
       </w:r>
       <w:r>
         <w:t xml:space="preserve"> </w:t>
@@ -724,14 +1113,12 @@
         <w:t xml:space="preserve">.</w:t>
       </w:r>
     </w:p>
-    <w:bookmarkEnd w:id="10"/>
-    <w:bookmarkStart w:id="11" w:name="자동화-스크립트-권장"/>
-    <w:p>
-      <w:pPr>
-        <w:pStyle w:val="Heading2"/>
-      </w:pPr>
-      <w:r>
-        <w:t xml:space="preserve">자동화 스크립트 (권장)</w:t>
+    <w:p>
+      <w:pPr>
+        <w:pStyle w:val="BodyText"/>
+      </w:pPr>
+      <w:r>
+        <w:t xml:space="preserve">수동 스크립트:</w:t>
       </w:r>
     </w:p>
     <w:p>
@@ -748,125 +1135,18 @@
         <w:rPr>
           <w:rStyle w:val="NormalTok"/>
         </w:rPr>
-        <w:t xml:space="preserve"> /Users/jimmy/_Workspace/ocr/scripts/openbao-unseal.sh</w:t>
-      </w:r>
-    </w:p>
-    <w:p>
-      <w:pPr>
-        <w:pStyle w:val="FirstParagraph"/>
-      </w:pPr>
-      <w:r>
-        <w:t xml:space="preserve">이 스크립트는 sealed=true일 때만 동작한다. Cron/systemd로 주기 호출해도 안전.</w:t>
-      </w:r>
-    </w:p>
-    <w:bookmarkEnd w:id="11"/>
-    <w:bookmarkStart w:id="12" w:name="why-지금은-수동인가"/>
-    <w:p>
-      <w:pPr>
-        <w:pStyle w:val="Heading2"/>
-      </w:pPr>
-      <w:r>
-        <w:t xml:space="preserve">Why 지금은 수동인가</w:t>
-      </w:r>
-    </w:p>
-    <w:p>
-      <w:pPr>
-        <w:pStyle w:val="Compact"/>
-        <w:numPr>
-          <w:ilvl w:val="0"/>
-          <w:numId w:val="1002"/>
-        </w:numPr>
-      </w:pPr>
-      <w:r>
-        <w:t xml:space="preserve">Shamir 5/3은 manual step 전제. Auto-unseal을 위해서는:</w:t>
-      </w:r>
-    </w:p>
-    <w:p>
-      <w:pPr>
-        <w:pStyle w:val="Compact"/>
-        <w:numPr>
-          <w:ilvl w:val="1"/>
-          <w:numId w:val="1003"/>
-        </w:numPr>
-      </w:pPr>
-      <w:r>
-        <w:rPr>
-          <w:b/>
-          <w:bCs/>
-        </w:rPr>
-        <w:t xml:space="preserve">K8s Transit unseal</w:t>
-      </w:r>
-      <w:r>
-        <w:t xml:space="preserve">: 별도 OpenBao 인스턴스의 transit engine으로 unseal. 순환 종속성(chicken-and-egg) 있음.</w:t>
-      </w:r>
-    </w:p>
-    <w:p>
-      <w:pPr>
-        <w:pStyle w:val="Compact"/>
-        <w:numPr>
-          <w:ilvl w:val="1"/>
-          <w:numId w:val="1003"/>
-        </w:numPr>
-      </w:pPr>
-      <w:r>
-        <w:rPr>
-          <w:b/>
-          <w:bCs/>
-        </w:rPr>
-        <w:t xml:space="preserve">SoftHSM PKCS#11</w:t>
-      </w:r>
-      <w:r>
-        <w:t xml:space="preserve">: SoftHSM 컨테이너가 HA 환경에서 consistency 문제.</w:t>
-      </w:r>
-    </w:p>
-    <w:p>
-      <w:pPr>
-        <w:pStyle w:val="Compact"/>
-        <w:numPr>
-          <w:ilvl w:val="1"/>
-          <w:numId w:val="1003"/>
-        </w:numPr>
-      </w:pPr>
-      <w:r>
-        <w:rPr>
-          <w:b/>
-          <w:bCs/>
-        </w:rPr>
-        <w:t xml:space="preserve">Cloud KMS</w:t>
-      </w:r>
-      <w:r>
-        <w:t xml:space="preserve"> </w:t>
-      </w:r>
-      <w:r>
-        <w:t xml:space="preserve">(AWS KMS/GCP KMS/Azure KeyVault): kind 환경엔 부적합.</w:t>
-      </w:r>
-    </w:p>
-    <w:p>
-      <w:pPr>
-        <w:pStyle w:val="Compact"/>
-        <w:numPr>
-          <w:ilvl w:val="0"/>
-          <w:numId w:val="1002"/>
-        </w:numPr>
-      </w:pPr>
-      <w:r>
-        <w:t xml:space="preserve">Phase 1에 K8s transit 또는 외부 KMS 도입 예정 (</w:t>
-      </w:r>
-      <w:r>
-        <w:rPr>
-          <w:rStyle w:val="VerbatimChar"/>
-        </w:rPr>
-        <w:t xml:space="preserve">docs/superpowers/specs/2026-04-18-ocr-solution-design.md</w:t>
-      </w:r>
-      <w:r>
-        <w:t xml:space="preserve"> </w:t>
-      </w:r>
-      <w:r>
-        <w:t xml:space="preserve">§A.5 Phase 1 TODO).</w:t>
-      </w:r>
-    </w:p>
-    <w:bookmarkEnd w:id="12"/>
-    <w:bookmarkStart w:id="13" w:name="트러블슈팅"/>
+        <w:t xml:space="preserve"> scripts/openbao-unseal.sh</w:t>
+      </w:r>
+    </w:p>
+    <w:p>
+      <w:r>
+        <w:pict>
+          <v:rect style="width:0;height:1.5pt" o:hralign="center" o:hrstd="t" o:hr="t"/>
+        </w:pict>
+      </w:r>
+    </w:p>
+    <w:bookmarkEnd w:id="14"/>
+    <w:bookmarkStart w:id="15" w:name="트러블슈팅"/>
     <w:p>
       <w:pPr>
         <w:pStyle w:val="Heading2"/>
@@ -932,10 +1212,22 @@
               <w:pStyle w:val="Compact"/>
             </w:pPr>
             <w:r>
+              <w:t xml:space="preserve">unsealer 로그</w:t>
+            </w:r>
+            <w:r>
+              <w:t xml:space="preserve"> </w:t>
+            </w:r>
+            <w:r>
               <w:rPr>
                 <w:rStyle w:val="VerbatimChar"/>
               </w:rPr>
-              <w:t xml:space="preserve">bao: command not found</w:t>
+              <w:t xml:space="preserve">jq: ...</w:t>
+            </w:r>
+            <w:r>
+              <w:t xml:space="preserve"> </w:t>
+            </w:r>
+            <w:r>
+              <w:t xml:space="preserve">파싱 오류</w:t>
             </w:r>
           </w:p>
         </w:tc>
@@ -946,7 +1238,7 @@
               <w:pStyle w:val="Compact"/>
             </w:pPr>
             <w:r>
-              <w:t xml:space="preserve">pod 이미지 변경</w:t>
+              <w:t xml:space="preserve">응답 형식 변경</w:t>
             </w:r>
           </w:p>
         </w:tc>
@@ -960,13 +1252,13 @@
               <w:rPr>
                 <w:rStyle w:val="VerbatimChar"/>
               </w:rPr>
-              <w:t xml:space="preserve">kubectl exec ... -- ls /bin/bao /usr/local/bin/bao</w:t>
+              <w:t xml:space="preserve">kubectl exec ... -- curl ... /v1/sys/seal-status</w:t>
             </w:r>
             <w:r>
               <w:t xml:space="preserve"> </w:t>
             </w:r>
             <w:r>
-              <w:t xml:space="preserve">로 실제 위치 확인</w:t>
+              <w:t xml:space="preserve">로 raw JSON 확인</w:t>
             </w:r>
           </w:p>
         </w:tc>
@@ -982,13 +1274,13 @@
               <w:rPr>
                 <w:rStyle w:val="VerbatimChar"/>
               </w:rPr>
-              <w:t xml:space="preserve">connection refused</w:t>
+              <w:t xml:space="preserve">WARN: unreachable</w:t>
             </w:r>
             <w:r>
               <w:t xml:space="preserve"> </w:t>
             </w:r>
             <w:r>
-              <w:t xml:space="preserve">on :8200</w:t>
+              <w:t xml:space="preserve">반복</w:t>
             </w:r>
           </w:p>
         </w:tc>
@@ -999,7 +1291,7 @@
               <w:pStyle w:val="Compact"/>
             </w:pPr>
             <w:r>
-              <w:t xml:space="preserve">리스너 아직 안 뜸</w:t>
+              <w:t xml:space="preserve">openbao pod 아직 기동 중</w:t>
             </w:r>
           </w:p>
         </w:tc>
@@ -1010,37 +1302,7 @@
               <w:pStyle w:val="Compact"/>
             </w:pPr>
             <w:r>
-              <w:rPr>
-                <w:rStyle w:val="VerbatimChar"/>
-              </w:rPr>
-              <w:t xml:space="preserve">sleep 10</w:t>
-            </w:r>
-            <w:r>
-              <w:t xml:space="preserve"> </w:t>
-            </w:r>
-            <w:r>
-              <w:t xml:space="preserve">후 재시도. listener TLS 설정 확인 (</w:t>
-            </w:r>
-            <w:r>
-              <w:rPr>
-                <w:rStyle w:val="VerbatimChar"/>
-              </w:rPr>
-              <w:t xml:space="preserve">values.yaml</w:t>
-            </w:r>
-            <w:r>
-              <w:t xml:space="preserve">의</w:t>
-            </w:r>
-            <w:r>
-              <w:t xml:space="preserve"> </w:t>
-            </w:r>
-            <w:r>
-              <w:rPr>
-                <w:rStyle w:val="VerbatimChar"/>
-              </w:rPr>
-              <w:t xml:space="preserve">tls_disable=0</w:t>
-            </w:r>
-            <w:r>
-              <w:t xml:space="preserve">)</w:t>
+              <w:t xml:space="preserve">30s 대기 후 재확인. openbao pod 로그 확인</w:t>
             </w:r>
           </w:p>
         </w:tc>
@@ -1053,16 +1315,22 @@
               <w:pStyle w:val="Compact"/>
             </w:pPr>
             <w:r>
+              <w:t xml:space="preserve">unsealer가</w:t>
+            </w:r>
+            <w:r>
+              <w:t xml:space="preserve"> </w:t>
+            </w:r>
+            <w:r>
               <w:rPr>
                 <w:rStyle w:val="VerbatimChar"/>
               </w:rPr>
-              <w:t xml:space="preserve">Seal Type : shamir</w:t>
+              <w:t xml:space="preserve">unseal SUCCESS</w:t>
             </w:r>
             <w:r>
               <w:t xml:space="preserve"> </w:t>
             </w:r>
             <w:r>
-              <w:t xml:space="preserve">없음</w:t>
+              <w:t xml:space="preserve">후 재기동 반복</w:t>
             </w:r>
           </w:p>
         </w:tc>
@@ -1073,7 +1341,7 @@
               <w:pStyle w:val="Compact"/>
             </w:pPr>
             <w:r>
-              <w:t xml:space="preserve">Pod 재초기화 or PVC 유실</w:t>
+              <w:t xml:space="preserve">liveness probe HTTP/HTTPS 불일치</w:t>
             </w:r>
           </w:p>
         </w:tc>
@@ -1084,14 +1352,7 @@
               <w:pStyle w:val="Compact"/>
             </w:pPr>
             <w:r>
-              <w:rPr>
-                <w:b/>
-                <w:bCs/>
-              </w:rPr>
-              <w:t xml:space="preserve">중대 사고</w:t>
-            </w:r>
-            <w:r>
-              <w:t xml:space="preserve">.</w:t>
+              <w:t xml:space="preserve">StatefulSet probe scheme 확인:</w:t>
             </w:r>
             <w:r>
               <w:t xml:space="preserve"> </w:t>
@@ -1100,56 +1361,13 @@
               <w:rPr>
                 <w:rStyle w:val="VerbatimChar"/>
               </w:rPr>
-              <w:t xml:space="preserve">openbao-init-keys</w:t>
+              <w:t xml:space="preserve">kubectl -n security get sts openbao -o jsonpath='{.spec.template.spec.containers[0].livenessProbe}'</w:t>
             </w:r>
             <w:r>
               <w:t xml:space="preserve"> </w:t>
             </w:r>
             <w:r>
-              <w:t xml:space="preserve">Secret의 root_token은 의미 없음 (새 unseal keys 필요). 복구:</w:t>
-            </w:r>
-            <w:r>
-              <w:t xml:space="preserve"> </w:t>
-            </w:r>
-            <w:r>
-              <w:rPr>
-                <w:rStyle w:val="VerbatimChar"/>
-              </w:rPr>
-              <w:t xml:space="preserve">bao operator init</w:t>
-            </w:r>
-            <w:r>
-              <w:t xml:space="preserve"> </w:t>
-            </w:r>
-            <w:r>
-              <w:t xml:space="preserve">재실행 →</w:t>
-            </w:r>
-            <w:r>
-              <w:t xml:space="preserve"> </w:t>
-            </w:r>
-            <w:r>
-              <w:rPr>
-                <w:b/>
-                <w:bCs/>
-              </w:rPr>
-              <w:t xml:space="preserve">이전 데이터 전체 손실</w:t>
-            </w:r>
-            <w:r>
-              <w:t xml:space="preserve">. Stage A5의 PVC</w:t>
-            </w:r>
-            <w:r>
-              <w:t xml:space="preserve"> </w:t>
-            </w:r>
-            <w:r>
-              <w:rPr>
-                <w:rStyle w:val="VerbatimChar"/>
-              </w:rPr>
-              <w:t xml:space="preserve">reclaimPolicy: Retain</w:t>
-            </w:r>
-            <w:r>
-              <w:t xml:space="preserve"> </w:t>
-            </w:r>
-            <w:r>
-              <w:t xml:space="preserve">설정 이후 이 사고 발생 가능성 크게 감소</w:t>
+              <w:t xml:space="preserve">→ scheme이 HTTP면 HTTPS로 patch</w:t>
             </w:r>
           </w:p>
         </w:tc>
@@ -1165,22 +1383,7 @@
               <w:rPr>
                 <w:rStyle w:val="VerbatimChar"/>
               </w:rPr>
-              <w:t xml:space="preserve">Unseal Progress 3/3</w:t>
-            </w:r>
-            <w:r>
-              <w:t xml:space="preserve"> </w:t>
-            </w:r>
-            <w:r>
-              <w:t xml:space="preserve">직후 여전히</w:t>
-            </w:r>
-            <w:r>
-              <w:t xml:space="preserve"> </w:t>
-            </w:r>
-            <w:r>
-              <w:rPr>
-                <w:rStyle w:val="VerbatimChar"/>
-              </w:rPr>
-              <w:t xml:space="preserve">Sealed: true</w:t>
+              <w:t xml:space="preserve">bao: command not found</w:t>
             </w:r>
           </w:p>
         </w:tc>
@@ -1191,7 +1394,7 @@
               <w:pStyle w:val="Compact"/>
             </w:pPr>
             <w:r>
-              <w:t xml:space="preserve">네트워크 파티션</w:t>
+              <w:t xml:space="preserve">pod 이미지 변경</w:t>
             </w:r>
           </w:p>
         </w:tc>
@@ -1202,20 +1405,323 @@
               <w:pStyle w:val="Compact"/>
             </w:pPr>
             <w:r>
+              <w:rPr>
+                <w:rStyle w:val="VerbatimChar"/>
+              </w:rPr>
+              <w:t xml:space="preserve">kubectl exec ... -- ls /bin/bao /usr/local/bin/bao</w:t>
+            </w:r>
+            <w:r>
+              <w:t xml:space="preserve"> </w:t>
+            </w:r>
+            <w:r>
+              <w:t xml:space="preserve">로 실제 위치 확인</w:t>
+            </w:r>
+          </w:p>
+        </w:tc>
+      </w:tr>
+      <w:tr>
+        <w:tc>
+          <w:tcPr/>
+          <w:p>
+            <w:pPr>
+              <w:pStyle w:val="Compact"/>
+            </w:pPr>
+            <w:r>
+              <w:rPr>
+                <w:rStyle w:val="VerbatimChar"/>
+              </w:rPr>
+              <w:t xml:space="preserve">connection refused</w:t>
+            </w:r>
+            <w:r>
+              <w:t xml:space="preserve"> </w:t>
+            </w:r>
+            <w:r>
+              <w:t xml:space="preserve">on :8200</w:t>
+            </w:r>
+          </w:p>
+        </w:tc>
+        <w:tc>
+          <w:tcPr/>
+          <w:p>
+            <w:pPr>
+              <w:pStyle w:val="Compact"/>
+            </w:pPr>
+            <w:r>
+              <w:t xml:space="preserve">리스너 아직 안 뜸</w:t>
+            </w:r>
+          </w:p>
+        </w:tc>
+        <w:tc>
+          <w:tcPr/>
+          <w:p>
+            <w:pPr>
+              <w:pStyle w:val="Compact"/>
+            </w:pPr>
+            <w:r>
+              <w:t xml:space="preserve">10s 후 재시도. listener TLS 설정 확인 (</w:t>
+            </w:r>
+            <w:r>
+              <w:rPr>
+                <w:rStyle w:val="VerbatimChar"/>
+              </w:rPr>
+              <w:t xml:space="preserve">values.yaml</w:t>
+            </w:r>
+            <w:r>
+              <w:t xml:space="preserve">의</w:t>
+            </w:r>
+            <w:r>
+              <w:t xml:space="preserve"> </w:t>
+            </w:r>
+            <w:r>
+              <w:rPr>
+                <w:rStyle w:val="VerbatimChar"/>
+              </w:rPr>
+              <w:t xml:space="preserve">tls_disable=0</w:t>
+            </w:r>
+            <w:r>
+              <w:t xml:space="preserve">)</w:t>
+            </w:r>
+          </w:p>
+        </w:tc>
+      </w:tr>
+      <w:tr>
+        <w:tc>
+          <w:tcPr/>
+          <w:p>
+            <w:pPr>
+              <w:pStyle w:val="Compact"/>
+            </w:pPr>
+            <w:r>
+              <w:rPr>
+                <w:rStyle w:val="VerbatimChar"/>
+              </w:rPr>
+              <w:t xml:space="preserve">Seal Type: shamir</w:t>
+            </w:r>
+            <w:r>
+              <w:t xml:space="preserve"> </w:t>
+            </w:r>
+            <w:r>
+              <w:t xml:space="preserve">없음</w:t>
+            </w:r>
+          </w:p>
+        </w:tc>
+        <w:tc>
+          <w:tcPr/>
+          <w:p>
+            <w:pPr>
+              <w:pStyle w:val="Compact"/>
+            </w:pPr>
+            <w:r>
+              <w:t xml:space="preserve">Pod 재초기화 or PVC 유실</w:t>
+            </w:r>
+          </w:p>
+        </w:tc>
+        <w:tc>
+          <w:tcPr/>
+          <w:p>
+            <w:pPr>
+              <w:pStyle w:val="Compact"/>
+            </w:pPr>
+            <w:r>
+              <w:rPr>
+                <w:b/>
+                <w:bCs/>
+              </w:rPr>
+              <w:t xml:space="preserve">중대 사고</w:t>
+            </w:r>
+            <w:r>
+              <w:t xml:space="preserve">. 복구:</w:t>
+            </w:r>
+            <w:r>
+              <w:t xml:space="preserve"> </w:t>
+            </w:r>
+            <w:r>
+              <w:rPr>
+                <w:rStyle w:val="VerbatimChar"/>
+              </w:rPr>
+              <w:t xml:space="preserve">bao operator init</w:t>
+            </w:r>
+            <w:r>
+              <w:t xml:space="preserve"> </w:t>
+            </w:r>
+            <w:r>
+              <w:t xml:space="preserve">재실행 →</w:t>
+            </w:r>
+            <w:r>
+              <w:t xml:space="preserve"> </w:t>
+            </w:r>
+            <w:r>
+              <w:rPr>
+                <w:b/>
+                <w:bCs/>
+              </w:rPr>
+              <w:t xml:space="preserve">이전 데이터 전체 손실</w:t>
+            </w:r>
+            <w:r>
+              <w:t xml:space="preserve">. Stage A5의 PVC</w:t>
+            </w:r>
+            <w:r>
+              <w:t xml:space="preserve"> </w:t>
+            </w:r>
+            <w:r>
+              <w:rPr>
+                <w:rStyle w:val="VerbatimChar"/>
+              </w:rPr>
+              <w:t xml:space="preserve">reclaimPolicy: Retain</w:t>
+            </w:r>
+            <w:r>
+              <w:t xml:space="preserve"> </w:t>
+            </w:r>
+            <w:r>
+              <w:t xml:space="preserve">설정으로 가능성 크게 감소</w:t>
+            </w:r>
+          </w:p>
+        </w:tc>
+      </w:tr>
+      <w:tr>
+        <w:tc>
+          <w:tcPr/>
+          <w:p>
+            <w:pPr>
+              <w:pStyle w:val="Compact"/>
+            </w:pPr>
+            <w:r>
+              <w:rPr>
+                <w:rStyle w:val="VerbatimChar"/>
+              </w:rPr>
+              <w:t xml:space="preserve">Unseal Progress 3/3</w:t>
+            </w:r>
+            <w:r>
+              <w:t xml:space="preserve"> </w:t>
+            </w:r>
+            <w:r>
+              <w:t xml:space="preserve">직후 여전히</w:t>
+            </w:r>
+            <w:r>
+              <w:t xml:space="preserve"> </w:t>
+            </w:r>
+            <w:r>
+              <w:rPr>
+                <w:rStyle w:val="VerbatimChar"/>
+              </w:rPr>
+              <w:t xml:space="preserve">Sealed: true</w:t>
+            </w:r>
+          </w:p>
+        </w:tc>
+        <w:tc>
+          <w:tcPr/>
+          <w:p>
+            <w:pPr>
+              <w:pStyle w:val="Compact"/>
+            </w:pPr>
+            <w:r>
+              <w:t xml:space="preserve">네트워크 파티션</w:t>
+            </w:r>
+          </w:p>
+        </w:tc>
+        <w:tc>
+          <w:tcPr/>
+          <w:p>
+            <w:pPr>
+              <w:pStyle w:val="Compact"/>
+            </w:pPr>
+            <w:r>
               <w:t xml:space="preserve">모든 pod에서 개별 unseal (replicas=1 dev에선 해당 없음)</w:t>
             </w:r>
           </w:p>
         </w:tc>
       </w:tr>
     </w:tbl>
-    <w:bookmarkEnd w:id="13"/>
-    <w:bookmarkStart w:id="15" w:name="phase-1-마이그레이션-가이드-스텁"/>
+    <w:p>
+      <w:r>
+        <w:pict>
+          <v:rect style="width:0;height:1.5pt" o:hralign="center" o:hrstd="t" o:hr="t"/>
+        </w:pict>
+      </w:r>
+    </w:p>
+    <w:bookmarkEnd w:id="15"/>
+    <w:bookmarkStart w:id="20" w:name="구현-세부사항"/>
     <w:p>
       <w:pPr>
         <w:pStyle w:val="Heading2"/>
       </w:pPr>
       <w:r>
-        <w:t xml:space="preserve">Phase 1 마이그레이션 가이드 (스텁)</w:t>
+        <w:t xml:space="preserve">구현 세부사항</w:t>
+      </w:r>
+    </w:p>
+    <w:bookmarkStart w:id="16" w:name="아키텍처"/>
+    <w:p>
+      <w:pPr>
+        <w:pStyle w:val="Heading3"/>
+      </w:pPr>
+      <w:r>
+        <w:t xml:space="preserve">아키텍처</w:t>
+      </w:r>
+    </w:p>
+    <w:p>
+      <w:pPr>
+        <w:pStyle w:val="SourceCode"/>
+      </w:pPr>
+      <w:r>
+        <w:rPr>
+          <w:rStyle w:val="VerbatimChar"/>
+        </w:rPr>
+        <w:t xml:space="preserve">openbao-unsealer (Deployment, security ns)</w:t>
+      </w:r>
+      <w:r>
+        <w:br/>
+      </w:r>
+      <w:r>
+        <w:rPr>
+          <w:rStyle w:val="VerbatimChar"/>
+        </w:rPr>
+        <w:t xml:space="preserve">  ├── ServiceAccount: openbao-unsealer (automountServiceAccountToken: false)</w:t>
+      </w:r>
+      <w:r>
+        <w:br/>
+      </w:r>
+      <w:r>
+        <w:rPr>
+          <w:rStyle w:val="VerbatimChar"/>
+        </w:rPr>
+        <w:t xml:space="preserve">  ├── ConfigMap: openbao-unsealer-env (BAO_ADDR, INTERVAL=10s)</w:t>
+      </w:r>
+      <w:r>
+        <w:br/>
+      </w:r>
+      <w:r>
+        <w:rPr>
+          <w:rStyle w:val="VerbatimChar"/>
+        </w:rPr>
+        <w:t xml:space="preserve">  ├── Secret 마운트: openbao-init-keys → /etc/openbao/init.json (readOnly)</w:t>
+      </w:r>
+      <w:r>
+        <w:br/>
+      </w:r>
+      <w:r>
+        <w:rPr>
+          <w:rStyle w:val="VerbatimChar"/>
+        </w:rPr>
+        <w:t xml:space="preserve">  ├── Secret 마운트: openbao-tls:ca.crt → /etc/ssl/openbao-ca/ca.crt (readOnly)</w:t>
+      </w:r>
+      <w:r>
+        <w:br/>
+      </w:r>
+      <w:r>
+        <w:rPr>
+          <w:rStyle w:val="VerbatimChar"/>
+        </w:rPr>
+        <w:t xml:space="preserve">  └── NetworkPolicy: egress DNS + openbao:8200 만 허용, ingress 없음</w:t>
+      </w:r>
+    </w:p>
+    <w:bookmarkEnd w:id="16"/>
+    <w:bookmarkStart w:id="17" w:name="이미지"/>
+    <w:p>
+      <w:pPr>
+        <w:pStyle w:val="Heading3"/>
+      </w:pPr>
+      <w:r>
+        <w:t xml:space="preserve">이미지</w:t>
       </w:r>
     </w:p>
     <w:p>
@@ -1223,11 +1729,20 @@
         <w:pStyle w:val="Compact"/>
         <w:numPr>
           <w:ilvl w:val="0"/>
-          <w:numId w:val="1004"/>
+          <w:numId w:val="1002"/>
         </w:numPr>
       </w:pPr>
       <w:r>
-        <w:t xml:space="preserve">Kubernetes auth method 활성</w:t>
+        <w:rPr>
+          <w:rStyle w:val="VerbatimChar"/>
+        </w:rPr>
+        <w:t xml:space="preserve">openbao-unsealer:v0.1.0</w:t>
+      </w:r>
+      <w:r>
+        <w:t xml:space="preserve"> </w:t>
+      </w:r>
+      <w:r>
+        <w:t xml:space="preserve">— Alpine 3.19 + curl + jq (24MB)</w:t>
       </w:r>
     </w:p>
     <w:p>
@@ -1235,11 +1750,32 @@
         <w:pStyle w:val="Compact"/>
         <w:numPr>
           <w:ilvl w:val="0"/>
-          <w:numId w:val="1004"/>
+          <w:numId w:val="1002"/>
         </w:numPr>
       </w:pPr>
       <w:r>
-        <w:t xml:space="preserve">별도 transit unseal OpenBao 인스턴스 배포 (또는 외부 Vault Enterprise / 클라우드 KMS)</w:t>
+        <w:t xml:space="preserve">소스:</w:t>
+      </w:r>
+      <w:r>
+        <w:t xml:space="preserve"> </w:t>
+      </w:r>
+      <w:r>
+        <w:rPr>
+          <w:rStyle w:val="VerbatimChar"/>
+        </w:rPr>
+        <w:t xml:space="preserve">services/openbao-unsealer/Dockerfile</w:t>
+      </w:r>
+      <w:r>
+        <w:t xml:space="preserve">,</w:t>
+      </w:r>
+      <w:r>
+        <w:t xml:space="preserve"> </w:t>
+      </w:r>
+      <w:r>
+        <w:rPr>
+          <w:rStyle w:val="VerbatimChar"/>
+        </w:rPr>
+        <w:t xml:space="preserve">services/openbao-unsealer/unsealer.sh</w:t>
       </w:r>
     </w:p>
     <w:p>
@@ -1247,20 +1783,177 @@
         <w:pStyle w:val="Compact"/>
         <w:numPr>
           <w:ilvl w:val="0"/>
-          <w:numId w:val="1004"/>
+          <w:numId w:val="1002"/>
         </w:numPr>
       </w:pPr>
       <w:r>
-        <w:rPr>
-          <w:rStyle w:val="VerbatimChar"/>
-        </w:rPr>
-        <w:t xml:space="preserve">seal "transit"</w:t>
-      </w:r>
-      <w:r>
-        <w:t xml:space="preserve"> </w:t>
-      </w:r>
-      <w:r>
-        <w:t xml:space="preserve">설정 stanza 추가</w:t>
+        <w:t xml:space="preserve">보안: non-root UID 1000, drop ALL caps, seccomp RuntimeDefault</w:t>
+      </w:r>
+    </w:p>
+    <w:bookmarkEnd w:id="17"/>
+    <w:bookmarkStart w:id="18" w:name="파일-목록"/>
+    <w:p>
+      <w:pPr>
+        <w:pStyle w:val="Heading3"/>
+      </w:pPr>
+      <w:r>
+        <w:t xml:space="preserve">파일 목록</w:t>
+      </w:r>
+    </w:p>
+    <w:tbl>
+      <w:tblPr>
+        <w:tblStyle w:val="Table"/>
+        <w:tblW w:type="auto" w:w="0"/>
+        <w:tblLook w:firstRow="1" w:lastRow="0" w:firstColumn="0" w:lastColumn="0" w:noHBand="0" w:noVBand="0" w:val="0020"/>
+      </w:tblPr>
+      <w:tblGrid>
+        <w:gridCol w:w="3960"/>
+        <w:gridCol w:w="3960"/>
+      </w:tblGrid>
+      <w:tr>
+        <w:trPr>
+          <w:tblHeader w:val="on"/>
+        </w:trPr>
+        <w:tc>
+          <w:tcPr/>
+          <w:p>
+            <w:pPr>
+              <w:pStyle w:val="Compact"/>
+            </w:pPr>
+            <w:r>
+              <w:t xml:space="preserve">파일</w:t>
+            </w:r>
+          </w:p>
+        </w:tc>
+        <w:tc>
+          <w:tcPr/>
+          <w:p>
+            <w:pPr>
+              <w:pStyle w:val="Compact"/>
+            </w:pPr>
+            <w:r>
+              <w:t xml:space="preserve">설명</w:t>
+            </w:r>
+          </w:p>
+        </w:tc>
+      </w:tr>
+      <w:tr>
+        <w:tc>
+          <w:tcPr/>
+          <w:p>
+            <w:pPr>
+              <w:pStyle w:val="Compact"/>
+            </w:pPr>
+            <w:r>
+              <w:rPr>
+                <w:rStyle w:val="VerbatimChar"/>
+              </w:rPr>
+              <w:t xml:space="preserve">infra/manifests/openbao/auto-unseal.yaml</w:t>
+            </w:r>
+          </w:p>
+        </w:tc>
+        <w:tc>
+          <w:tcPr/>
+          <w:p>
+            <w:pPr>
+              <w:pStyle w:val="Compact"/>
+            </w:pPr>
+            <w:r>
+              <w:t xml:space="preserve">Deployment + SA + ConfigMap + NetworkPolicy</w:t>
+            </w:r>
+          </w:p>
+        </w:tc>
+      </w:tr>
+      <w:tr>
+        <w:tc>
+          <w:tcPr/>
+          <w:p>
+            <w:pPr>
+              <w:pStyle w:val="Compact"/>
+            </w:pPr>
+            <w:r>
+              <w:rPr>
+                <w:rStyle w:val="VerbatimChar"/>
+              </w:rPr>
+              <w:t xml:space="preserve">services/openbao-unsealer/unsealer.sh</w:t>
+            </w:r>
+          </w:p>
+        </w:tc>
+        <w:tc>
+          <w:tcPr/>
+          <w:p>
+            <w:pPr>
+              <w:pStyle w:val="Compact"/>
+            </w:pPr>
+            <w:r>
+              <w:t xml:space="preserve">폴링 루프 스크립트</w:t>
+            </w:r>
+          </w:p>
+        </w:tc>
+      </w:tr>
+      <w:tr>
+        <w:tc>
+          <w:tcPr/>
+          <w:p>
+            <w:pPr>
+              <w:pStyle w:val="Compact"/>
+            </w:pPr>
+            <w:r>
+              <w:rPr>
+                <w:rStyle w:val="VerbatimChar"/>
+              </w:rPr>
+              <w:t xml:space="preserve">services/openbao-unsealer/Dockerfile</w:t>
+            </w:r>
+          </w:p>
+        </w:tc>
+        <w:tc>
+          <w:tcPr/>
+          <w:p>
+            <w:pPr>
+              <w:pStyle w:val="Compact"/>
+            </w:pPr>
+            <w:r>
+              <w:t xml:space="preserve">Alpine 기반 이미지</w:t>
+            </w:r>
+          </w:p>
+        </w:tc>
+      </w:tr>
+      <w:tr>
+        <w:tc>
+          <w:tcPr/>
+          <w:p>
+            <w:pPr>
+              <w:pStyle w:val="Compact"/>
+            </w:pPr>
+            <w:r>
+              <w:rPr>
+                <w:rStyle w:val="VerbatimChar"/>
+              </w:rPr>
+              <w:t xml:space="preserve">tests/smoke/openbao_auto_unseal_smoke.sh</w:t>
+            </w:r>
+          </w:p>
+        </w:tc>
+        <w:tc>
+          <w:tcPr/>
+          <w:p>
+            <w:pPr>
+              <w:pStyle w:val="Compact"/>
+            </w:pPr>
+            <w:r>
+              <w:t xml:space="preserve">auto-unseal smoke test</w:t>
+            </w:r>
+          </w:p>
+        </w:tc>
+      </w:tr>
+    </w:tbl>
+    <w:bookmarkEnd w:id="18"/>
+    <w:bookmarkStart w:id="19" w:name="알려진-한계-phase-1-carry-over"/>
+    <w:p>
+      <w:pPr>
+        <w:pStyle w:val="Heading3"/>
+      </w:pPr>
+      <w:r>
+        <w:t xml:space="preserve">알려진 한계 (Phase 1 carry-over)</w:t>
       </w:r>
     </w:p>
     <w:p>
@@ -1268,11 +1961,30 @@
         <w:pStyle w:val="Compact"/>
         <w:numPr>
           <w:ilvl w:val="0"/>
+          <w:numId w:val="1003"/>
+        </w:numPr>
+      </w:pPr>
+      <w:r>
+        <w:rPr>
+          <w:b/>
+          <w:bCs/>
+        </w:rPr>
+        <w:t xml:space="preserve">Multi-node Raft</w:t>
+      </w:r>
+      <w:r>
+        <w:t xml:space="preserve">: 현재 single-node(openbao-0). 3-node 환경에서는 모든 pod를 개별 unseal해야 함.</w:t>
+      </w:r>
+    </w:p>
+    <w:p>
+      <w:pPr>
+        <w:pStyle w:val="Compact"/>
+        <w:numPr>
+          <w:ilvl w:val="1"/>
           <w:numId w:val="1004"/>
         </w:numPr>
       </w:pPr>
       <w:r>
-        <w:t xml:space="preserve">실 unseal 후 seal-migrate 명령으로 기존 Shamir → Transit 변환</w:t>
+        <w:t xml:space="preserve">대응: unsealer를 각 pod에 순차 unseal하도록 수정 필요 (poll loop에서 pod 목록 iterate)</w:t>
       </w:r>
     </w:p>
     <w:p>
@@ -1280,40 +1992,45 @@
         <w:pStyle w:val="Compact"/>
         <w:numPr>
           <w:ilvl w:val="0"/>
-          <w:numId w:val="1004"/>
+          <w:numId w:val="1003"/>
         </w:numPr>
       </w:pPr>
       <w:r>
-        <w:t xml:space="preserve">Shamir 키 5개 안전 파기 (또는 BCP-용으로 분산 보관)</w:t>
-      </w:r>
-    </w:p>
-    <w:p>
-      <w:pPr>
-        <w:pStyle w:val="FirstParagraph"/>
-      </w:pPr>
-      <w:r>
-        <w:t xml:space="preserve">자세한 공식 문서:</w:t>
-      </w:r>
-      <w:r>
-        <w:t xml:space="preserve"> </w:t>
-      </w:r>
-      <w:hyperlink r:id="rId14">
-        <w:r>
-          <w:rPr>
-            <w:rStyle w:val="Hyperlink"/>
-          </w:rPr>
-          <w:t xml:space="preserve">https://openbao.org/docs/commands/operator/migrate/</w:t>
-        </w:r>
-      </w:hyperlink>
-    </w:p>
-    <w:bookmarkEnd w:id="15"/>
-    <w:bookmarkStart w:id="16" w:name="관련-파일"/>
-    <w:p>
-      <w:pPr>
-        <w:pStyle w:val="Heading2"/>
-      </w:pPr>
-      <w:r>
-        <w:t xml:space="preserve">관련 파일</w:t>
+        <w:rPr>
+          <w:b/>
+          <w:bCs/>
+        </w:rPr>
+        <w:t xml:space="preserve">신뢰 경계</w:t>
+      </w:r>
+      <w:r>
+        <w:t xml:space="preserve">: Shamir 키가</w:t>
+      </w:r>
+      <w:r>
+        <w:t xml:space="preserve"> </w:t>
+      </w:r>
+      <w:r>
+        <w:rPr>
+          <w:rStyle w:val="VerbatimChar"/>
+        </w:rPr>
+        <w:t xml:space="preserve">openbao-init-keys</w:t>
+      </w:r>
+      <w:r>
+        <w:t xml:space="preserve"> </w:t>
+      </w:r>
+      <w:r>
+        <w:t xml:space="preserve">Secret에 평문(base64). 현재 상태와 동일 수준.</w:t>
+      </w:r>
+    </w:p>
+    <w:p>
+      <w:pPr>
+        <w:pStyle w:val="Compact"/>
+        <w:numPr>
+          <w:ilvl w:val="1"/>
+          <w:numId w:val="1005"/>
+        </w:numPr>
+      </w:pPr>
+      <w:r>
+        <w:t xml:space="preserve">운영 환경: SealedSecrets 또는 외부 KMS로 교체 필요.</w:t>
       </w:r>
     </w:p>
     <w:p>
@@ -1321,20 +2038,90 @@
         <w:pStyle w:val="Compact"/>
         <w:numPr>
           <w:ilvl w:val="0"/>
-          <w:numId w:val="1005"/>
+          <w:numId w:val="1003"/>
         </w:numPr>
       </w:pPr>
       <w:r>
         <w:rPr>
+          <w:b/>
+          <w:bCs/>
+        </w:rPr>
+        <w:t xml:space="preserve">jq false 파싱</w:t>
+      </w:r>
+      <w:r>
+        <w:t xml:space="preserve">:</w:t>
+      </w:r>
+      <w:r>
+        <w:t xml:space="preserve"> </w:t>
+      </w:r>
+      <w:r>
+        <w:rPr>
           <w:rStyle w:val="VerbatimChar"/>
         </w:rPr>
-        <w:t xml:space="preserve">infra/helm/values/dev/openbao.yaml</w:t>
-      </w:r>
-      <w:r>
-        <w:t xml:space="preserve"> </w:t>
-      </w:r>
-      <w:r>
-        <w:t xml:space="preserve">— probe scheme HTTPS + seal 설정</w:t>
+        <w:t xml:space="preserve">false // "default"</w:t>
+      </w:r>
+      <w:r>
+        <w:t xml:space="preserve"> </w:t>
+      </w:r>
+      <w:r>
+        <w:t xml:space="preserve">jq 관용구는 JSON</w:t>
+      </w:r>
+      <w:r>
+        <w:t xml:space="preserve"> </w:t>
+      </w:r>
+      <w:r>
+        <w:rPr>
+          <w:rStyle w:val="VerbatimChar"/>
+        </w:rPr>
+        <w:t xml:space="preserve">false</w:t>
+      </w:r>
+      <w:r>
+        <w:t xml:space="preserve">를 falsy로 처리.</w:t>
+      </w:r>
+    </w:p>
+    <w:p>
+      <w:pPr>
+        <w:pStyle w:val="Compact"/>
+        <w:numPr>
+          <w:ilvl w:val="1"/>
+          <w:numId w:val="1006"/>
+        </w:numPr>
+      </w:pPr>
+      <w:r>
+        <w:t xml:space="preserve">해결: 스크립트 내</w:t>
+      </w:r>
+      <w:r>
+        <w:t xml:space="preserve"> </w:t>
+      </w:r>
+      <w:r>
+        <w:rPr>
+          <w:rStyle w:val="VerbatimChar"/>
+        </w:rPr>
+        <w:t xml:space="preserve">| tostring</w:t>
+      </w:r>
+      <w:r>
+        <w:t xml:space="preserve"> </w:t>
+      </w:r>
+      <w:r>
+        <w:t xml:space="preserve">사용으로 수정 완료.</w:t>
+      </w:r>
+    </w:p>
+    <w:p>
+      <w:r>
+        <w:pict>
+          <v:rect style="width:0;height:1.5pt" o:hralign="center" o:hrstd="t" o:hr="t"/>
+        </w:pict>
+      </w:r>
+    </w:p>
+    <w:bookmarkEnd w:id="19"/>
+    <w:bookmarkEnd w:id="20"/>
+    <w:bookmarkStart w:id="21" w:name="관련-파일"/>
+    <w:p>
+      <w:pPr>
+        <w:pStyle w:val="Heading2"/>
+      </w:pPr>
+      <w:r>
+        <w:t xml:space="preserve">관련 파일</w:t>
       </w:r>
     </w:p>
     <w:p>
@@ -1342,26 +2129,20 @@
         <w:pStyle w:val="Compact"/>
         <w:numPr>
           <w:ilvl w:val="0"/>
-          <w:numId w:val="1005"/>
+          <w:numId w:val="1007"/>
         </w:numPr>
       </w:pPr>
       <w:r>
-        <w:t xml:space="preserve">Secret</w:t>
-      </w:r>
-      <w:r>
-        <w:t xml:space="preserve"> </w:t>
-      </w:r>
-      <w:r>
         <w:rPr>
           <w:rStyle w:val="VerbatimChar"/>
         </w:rPr>
-        <w:t xml:space="preserve">security/openbao-init-keys</w:t>
-      </w:r>
-      <w:r>
-        <w:t xml:space="preserve"> </w:t>
-      </w:r>
-      <w:r>
-        <w:t xml:space="preserve">— 5 Shamir keys + root token (dev-only!)</w:t>
+        <w:t xml:space="preserve">infra/helm/values/dev/openbao.yaml</w:t>
+      </w:r>
+      <w:r>
+        <w:t xml:space="preserve"> </w:t>
+      </w:r>
+      <w:r>
+        <w:t xml:space="preserve">— probe scheme HTTPS + seal 설정</w:t>
       </w:r>
     </w:p>
     <w:p>
@@ -1369,24 +2150,72 @@
         <w:pStyle w:val="Compact"/>
         <w:numPr>
           <w:ilvl w:val="0"/>
-          <w:numId w:val="1005"/>
+          <w:numId w:val="1007"/>
         </w:numPr>
       </w:pPr>
       <w:r>
+        <w:t xml:space="preserve">Secret</w:t>
+      </w:r>
+      <w:r>
+        <w:t xml:space="preserve"> </w:t>
+      </w:r>
+      <w:r>
         <w:rPr>
           <w:rStyle w:val="VerbatimChar"/>
         </w:rPr>
+        <w:t xml:space="preserve">security/openbao-init-keys</w:t>
+      </w:r>
+      <w:r>
+        <w:t xml:space="preserve"> </w:t>
+      </w:r>
+      <w:r>
+        <w:t xml:space="preserve">— 5 Shamir keys + root token (dev-only!)</w:t>
+      </w:r>
+    </w:p>
+    <w:p>
+      <w:pPr>
+        <w:pStyle w:val="Compact"/>
+        <w:numPr>
+          <w:ilvl w:val="0"/>
+          <w:numId w:val="1007"/>
+        </w:numPr>
+      </w:pPr>
+      <w:r>
+        <w:rPr>
+          <w:rStyle w:val="VerbatimChar"/>
+        </w:rPr>
         <w:t xml:space="preserve">tests/smoke/openbao_transit_test.sh</w:t>
       </w:r>
       <w:r>
         <w:t xml:space="preserve"> </w:t>
       </w:r>
       <w:r>
-        <w:t xml:space="preserve">— unseal 검증</w:t>
-      </w:r>
-    </w:p>
-    <w:bookmarkEnd w:id="16"/>
-    <w:bookmarkEnd w:id="17"/>
+        <w:t xml:space="preserve">— transit unseal 검증</w:t>
+      </w:r>
+    </w:p>
+    <w:p>
+      <w:pPr>
+        <w:pStyle w:val="Compact"/>
+        <w:numPr>
+          <w:ilvl w:val="0"/>
+          <w:numId w:val="1007"/>
+        </w:numPr>
+      </w:pPr>
+      <w:r>
+        <w:rPr>
+          <w:rStyle w:val="VerbatimChar"/>
+        </w:rPr>
+        <w:t xml:space="preserve">tests/smoke/openbao_auto_unseal_smoke.sh</w:t>
+      </w:r>
+      <w:r>
+        <w:t xml:space="preserve"> </w:t>
+      </w:r>
+      <w:r>
+        <w:t xml:space="preserve">— auto-unseal watcher 검증 (Phase 1 추가)</w:t>
+      </w:r>
+    </w:p>
+    <w:bookmarkEnd w:id="21"/>
+    <w:bookmarkEnd w:id="22"/>
     <w:sectPr>
       <w:footnotePr>
         <w:numRestart w:val="eachSect"/>
@@ -1695,9 +2524,6 @@
     <w:abstractNumId w:val="991"/>
   </w:num>
   <w:num w:numId="1003">
-    <w:abstractNumId w:val="991"/>
-  </w:num>
-  <w:num w:numId="1004">
     <w:abstractNumId w:val="99411"/>
     <w:lvlOverride w:ilvl="0">
       <w:startOverride w:val="1"/>
@@ -1727,7 +2553,16 @@
       <w:startOverride w:val="1"/>
     </w:lvlOverride>
   </w:num>
+  <w:num w:numId="1004">
+    <w:abstractNumId w:val="991"/>
+  </w:num>
   <w:num w:numId="1005">
+    <w:abstractNumId w:val="991"/>
+  </w:num>
+  <w:num w:numId="1006">
+    <w:abstractNumId w:val="991"/>
+  </w:num>
+  <w:num w:numId="1007">
     <w:abstractNumId w:val="991"/>
   </w:num>
 </w:numbering>

</xml_diff>